<commit_message>
v2: brand film (4 formats), logo reveal, sting, plate loop, Lottie sting; guidelines v2 and quick reference; strategy v2; QA v2 (31/31); v1 motion archived
Co-Authored-By: Claude Opus 5.5 <noreply@anthropic.com>
Claude-Session: https://claude.ai/code/session_01DLSMnj5wd3Rg3Zvu6XTEmR
</commit_message>
<xml_diff>
--- a/DESTINATION-NIGERIA-BRAND-KIT/09_DOCUMENT_TEMPLATES/INVOICES/DN_Invoice_Template_A4.docx
+++ b/DESTINATION-NIGERIA-BRAND-KIT/09_DOCUMENT_TEMPLATES/INVOICES/DN_Invoice_Template_A4.docx
@@ -211,8 +211,8 @@
             </w:pPr>
             <w:sdt>
               <w:sdtPr>
-                <w:alias w:val="Email"/>
-                <w:tag w:val="email"/>
+                <w:alias w:val="Client email"/>
+                <w:tag w:val="client_email"/>
                 <w:text/>
               </w:sdtPr>
               <w:sdtContent>
@@ -220,7 +220,7 @@
                   <w:rPr>
                     <w:color w:val="5F6662"/>
                   </w:rPr>
-                  <w:t xml:space="preserve">[Email]</w:t>
+                  <w:t xml:space="preserve">[Client email]</w:t>
                 </w:r>
               </w:sdtContent>
             </w:sdt>

</xml_diff>